<commit_message>
700 k€ = montant de notes de crédit traitées (pas un gain) ; SQL simplifié en notions (Randstad)
Co-Authored-By: Claude Opus 5.5 <noreply@anthropic.com>
Claude-Session: https://claude.ai/code/session_01Uwm2tAGtUGTnWWMUSVQkub
</commit_message>
<xml_diff>
--- a/output/CV_NicolasQiGUO_Randstad.docx
+++ b/output/CV_NicolasQiGUO_Randstad.docx
@@ -144,7 +144,7 @@
           <w:sz w:val="19"/>
           <w:u w:val="none"/>
         </w:rPr>
-        <w:t>3 ans d'expérience au sein de grands groupes (BNP Paribas, La Poste). Pilotage de projets SI Finance de bout en bout, du recueil des besoins à la recette et au déploiement, coordination Métiers–IT et pilotage de prestataires. Bases techniques : Power Platform, SQL, PHP.</w:t>
+        <w:t>3 ans d'expérience au sein de grands groupes (BNP Paribas, La Poste). Pilotage de projets SI Finance de bout en bout, du recueil des besoins à la recette et au déploiement, coordination Métiers–IT et pilotage de prestataires. Double compétence fonctionnelle et technique, avec une expérience en développement low-code (Power Platform) et des bases en programmation et bases de données acquises en formation.</w:t>
       </w:r>
     </w:p>
     <w:p>
@@ -734,7 +734,7 @@
           <w:sz w:val="19"/>
           <w:u w:val="none"/>
         </w:rPr>
-        <w:t>(création et comptabilisation dans SAP des notes de crédit) : développement de la partie Power Platform ; traitement de plusieurs semaines à quasi instantané, impact &gt; 700 k€</w:t>
+        <w:t>(création et comptabilisation dans SAP des notes de crédit) : développement de la partie Power Platform ; délai de plusieurs semaines à quasi instantané, &gt; 700 k€ de notes de crédit traitées</w:t>
       </w:r>
     </w:p>
     <w:p>
@@ -1117,7 +1117,7 @@
           <w:sz w:val="18"/>
           <w:u w:val="none"/>
         </w:rPr>
-        <w:t>Enseignements : ERP (SAP S/4HANA, ECC), bases de données relationnelles (SQL, PostgreSQL, Oracle), PHP</w:t>
+        <w:t>Enseignements : ERP (SAP), bases de données relationnelles (PostgreSQL, Oracle)</w:t>
       </w:r>
     </w:p>
     <w:p>
@@ -1341,7 +1341,7 @@
           <w:u w:val="none"/>
         </w:rPr>
         <w:tab/>
-        <w:t>SI Finance, SAP (S/4HANA, ECC), interfaces applicatives, gouvernance des SI</w:t>
+        <w:t>SI Finance, SAP, interfaces applicatives, gouvernance des SI</w:t>
       </w:r>
     </w:p>
     <w:p>
@@ -1451,7 +1451,7 @@
           <w:u w:val="none"/>
         </w:rPr>
         <w:tab/>
-        <w:t>SQL (requêtes, vues, procédures stockées), PHP, Java, C#, C, Python</w:t>
+        <w:t>SQL, PHP, Java, C#, C, Python, HTML/CSS</w:t>
       </w:r>
     </w:p>
     <w:p>

</xml_diff>